<commit_message>
Postman m1 et debut m2
</commit_message>
<xml_diff>
--- a/Katalan Studio/Katalon_Studio_Prise_main.docx
+++ b/Katalan Studio/Katalon_Studio_Prise_main.docx
@@ -180,7 +180,7 @@
           <w:r>
             <w:fldChar w:fldCharType="separate"/>
           </w:r>
-          <w:hyperlink w:anchor="_Toc236120583" w:history="1">
+          <w:hyperlink w:anchor="_Toc236181048" w:history="1">
             <w:r>
               <w:rPr>
                 <w:rStyle w:val="Lienhypertexte"/>
@@ -207,7 +207,7 @@
                 <w:noProof/>
                 <w:webHidden/>
               </w:rPr>
-              <w:instrText xml:space="preserve"> PAGEREF _Toc236120583 \h </w:instrText>
+              <w:instrText xml:space="preserve"> PAGEREF _Toc236181048 \h </w:instrText>
             </w:r>
             <w:r>
               <w:rPr>
@@ -250,7 +250,7 @@
               <w:lang w:eastAsia="fr-FR"/>
             </w:rPr>
           </w:pPr>
-          <w:hyperlink w:anchor="_Toc236120584" w:history="1">
+          <w:hyperlink w:anchor="_Toc236181049" w:history="1">
             <w:r>
               <w:rPr>
                 <w:rStyle w:val="Lienhypertexte"/>
@@ -277,7 +277,7 @@
                 <w:noProof/>
                 <w:webHidden/>
               </w:rPr>
-              <w:instrText xml:space="preserve"> PAGEREF _Toc236120584 \h </w:instrText>
+              <w:instrText xml:space="preserve"> PAGEREF _Toc236181049 \h </w:instrText>
             </w:r>
             <w:r>
               <w:rPr>
@@ -320,7 +320,7 @@
               <w:lang w:eastAsia="fr-FR"/>
             </w:rPr>
           </w:pPr>
-          <w:hyperlink w:anchor="_Toc236120585" w:history="1">
+          <w:hyperlink w:anchor="_Toc236181050" w:history="1">
             <w:r>
               <w:rPr>
                 <w:rStyle w:val="Lienhypertexte"/>
@@ -347,7 +347,7 @@
                 <w:noProof/>
                 <w:webHidden/>
               </w:rPr>
-              <w:instrText xml:space="preserve"> PAGEREF _Toc236120585 \h </w:instrText>
+              <w:instrText xml:space="preserve"> PAGEREF _Toc236181050 \h </w:instrText>
             </w:r>
             <w:r>
               <w:rPr>
@@ -390,7 +390,7 @@
               <w:lang w:eastAsia="fr-FR"/>
             </w:rPr>
           </w:pPr>
-          <w:hyperlink w:anchor="_Toc236120586" w:history="1">
+          <w:hyperlink w:anchor="_Toc236181051" w:history="1">
             <w:r>
               <w:rPr>
                 <w:rStyle w:val="Lienhypertexte"/>
@@ -417,7 +417,7 @@
                 <w:noProof/>
                 <w:webHidden/>
               </w:rPr>
-              <w:instrText xml:space="preserve"> PAGEREF _Toc236120586 \h </w:instrText>
+              <w:instrText xml:space="preserve"> PAGEREF _Toc236181051 \h </w:instrText>
             </w:r>
             <w:r>
               <w:rPr>
@@ -532,7 +532,7 @@
       <w:pPr>
         <w:pStyle w:val="Titre1"/>
       </w:pPr>
-      <w:bookmarkStart w:id="0" w:name="_Toc236120583"/>
+      <w:bookmarkStart w:id="0" w:name="_Toc236181048"/>
       <w:r>
         <w:lastRenderedPageBreak/>
         <w:t>Découverte de l'outil</w:t>
@@ -543,12 +543,9 @@
       <w:pPr>
         <w:pStyle w:val="Titre2"/>
       </w:pPr>
-      <w:bookmarkStart w:id="1" w:name="_Toc236120584"/>
+      <w:bookmarkStart w:id="1" w:name="_Toc236181049"/>
       <w:r>
-        <w:t>Configuration raccourcie</w:t>
-      </w:r>
-      <w:r>
-        <w:t xml:space="preserve"> de capture</w:t>
+        <w:t>Configuration raccourcie de capture</w:t>
       </w:r>
       <w:bookmarkEnd w:id="1"/>
     </w:p>
@@ -663,6 +660,9 @@
         </mc:AlternateContent>
       </w:r>
       <w:r>
+        <w:rPr>
+          <w:noProof/>
+        </w:rPr>
         <w:drawing>
           <wp:inline distT="0" distB="0" distL="0" distR="0" wp14:anchorId="32963DE3" wp14:editId="5EB1035F">
             <wp:extent cx="5760720" cy="1748155"/>
@@ -838,6 +838,9 @@
         </mc:AlternateContent>
       </w:r>
       <w:r>
+        <w:rPr>
+          <w:noProof/>
+        </w:rPr>
         <w:drawing>
           <wp:inline distT="0" distB="0" distL="0" distR="0" wp14:anchorId="3B695222" wp14:editId="09B4F63D">
             <wp:extent cx="5760720" cy="5036820"/>
@@ -881,7 +884,7 @@
       <w:pPr>
         <w:pStyle w:val="Titre1"/>
       </w:pPr>
-      <w:bookmarkStart w:id="2" w:name="_Toc236120585"/>
+      <w:bookmarkStart w:id="2" w:name="_Toc236181050"/>
       <w:r>
         <w:lastRenderedPageBreak/>
         <w:t>Création d’un projet</w:t>
@@ -935,6 +938,9 @@
         </mc:AlternateContent>
       </w:r>
       <w:r>
+        <w:rPr>
+          <w:noProof/>
+        </w:rPr>
         <w:drawing>
           <wp:inline distT="0" distB="0" distL="0" distR="0" wp14:anchorId="7AAC0F05" wp14:editId="35C933FE">
             <wp:extent cx="5087060" cy="6439799"/>
@@ -975,6 +981,9 @@
     <w:p/>
     <w:p>
       <w:r>
+        <w:rPr>
+          <w:noProof/>
+        </w:rPr>
         <w:lastRenderedPageBreak/>
         <w:drawing>
           <wp:inline distT="0" distB="0" distL="0" distR="0" wp14:anchorId="1479D956" wp14:editId="31F37605">
@@ -1018,7 +1027,7 @@
       <w:pPr>
         <w:pStyle w:val="Titre1"/>
       </w:pPr>
-      <w:bookmarkStart w:id="3" w:name="_Toc236120586"/>
+      <w:bookmarkStart w:id="3" w:name="_Toc236181051"/>
       <w:r>
         <w:t>Prise en main</w:t>
       </w:r>
@@ -1042,6 +1051,26 @@
       <w:pPr>
         <w:pStyle w:val="Titre1"/>
       </w:pPr>
+    </w:p>
+    <w:p>
+      <w:pPr>
+        <w:rPr>
+          <w:noProof/>
+        </w:rPr>
+      </w:pPr>
+    </w:p>
+    <w:p>
+      <w:pPr>
+        <w:rPr>
+          <w:noProof/>
+        </w:rPr>
+      </w:pPr>
+      <w:r>
+        <w:rPr>
+          <w:noProof/>
+        </w:rPr>
+        <w:br w:type="page"/>
+      </w:r>
     </w:p>
     <w:p>
       <w:pPr>
@@ -5938,6 +5967,7 @@
   <w:style w:type="character" w:default="1" w:styleId="Policepardfaut">
     <w:name w:val="Default Paragraph Font"/>
     <w:uiPriority w:val="1"/>
+    <w:semiHidden/>
     <w:unhideWhenUsed/>
   </w:style>
   <w:style w:type="table" w:default="1" w:styleId="TableauNormal">

</xml_diff>